<commit_message>
feat: resolve typescript type issues, update document engine resolvers and land acquisition components
</commit_message>
<xml_diff>
--- a/src/lib/engines/docx/templates/Form-VII-Template.docx
+++ b/src/lib/engines/docx/templates/Form-VII-Template.docx
@@ -1,6 +1,6 @@
 
 <file path=word/document.xml><?xml version="1.0" encoding="utf-8"?>
-<w:document xmlns:wpc="http://schemas.microsoft.com/office/word/2010/wordprocessingCanvas" xmlns:mc="http://schemas.openxmlformats.org/markup-compatibility/2006" xmlns:o="urn:schemas-microsoft-com:office:office" xmlns:r="http://schemas.openxmlformats.org/officeDocument/2006/relationships" xmlns:m="http://schemas.openxmlformats.org/officeDocument/2006/math" xmlns:v="urn:schemas-microsoft-com:vml" xmlns:wp14="http://schemas.microsoft.com/office/word/2010/wordprocessingDrawing" xmlns:wp="http://schemas.openxmlformats.org/drawingml/2006/wordprocessingDrawing" xmlns:w="http://schemas.openxmlformats.org/wordprocessingml/2006/main" xmlns:w14="http://schemas.microsoft.com/office/word/2010/wordml" xmlns:w10="urn:schemas-microsoft-com:office:word" xmlns:w15="http://schemas.microsoft.com/office/word/2012/wordml" xmlns:wpg="http://schemas.microsoft.com/office/word/2010/wordprocessingGroup" xmlns:wpi="http://schemas.microsoft.com/office/word/2010/wordprocessingInk" xmlns:wne="http://schemas.microsoft.com/office/word/2006/wordml" xmlns:wps="http://schemas.microsoft.com/office/word/2010/wordprocessingShape" xmlns:wpsCustomData="http://www.wps.cn/officeDocument/2013/wpsCustomData" mc:Ignorable="w14 w15 wp14">
+<w:document xmlns:wpc="http://schemas.microsoft.com/office/word/2010/wordprocessingCanvas" xmlns:cx="http://schemas.microsoft.com/office/drawing/2014/chartex" xmlns:cx1="http://schemas.microsoft.com/office/drawing/2015/9/8/chartex" xmlns:cx2="http://schemas.microsoft.com/office/drawing/2015/10/21/chartex" xmlns:cx3="http://schemas.microsoft.com/office/drawing/2016/5/9/chartex" xmlns:cx4="http://schemas.microsoft.com/office/drawing/2016/5/10/chartex" xmlns:cx5="http://schemas.microsoft.com/office/drawing/2016/5/11/chartex" xmlns:cx6="http://schemas.microsoft.com/office/drawing/2016/5/12/chartex" xmlns:cx7="http://schemas.microsoft.com/office/drawing/2016/5/13/chartex" xmlns:cx8="http://schemas.microsoft.com/office/drawing/2016/5/14/chartex" xmlns:mc="http://schemas.openxmlformats.org/markup-compatibility/2006" xmlns:o="urn:schemas-microsoft-com:office:office" xmlns:r="http://schemas.openxmlformats.org/officeDocument/2006/relationships" xmlns:m="http://schemas.openxmlformats.org/officeDocument/2006/math" xmlns:v="urn:schemas-microsoft-com:vml" xmlns:wp14="http://schemas.microsoft.com/office/word/2010/wordprocessingDrawing" xmlns:wp="http://schemas.openxmlformats.org/drawingml/2006/wordprocessingDrawing" xmlns:w="http://schemas.openxmlformats.org/wordprocessingml/2006/main" xmlns:w14="http://schemas.microsoft.com/office/word/2010/wordml" xmlns:w10="urn:schemas-microsoft-com:office:word" xmlns:w15="http://schemas.microsoft.com/office/word/2012/wordml" xmlns:wpg="http://schemas.microsoft.com/office/word/2010/wordprocessingGroup" xmlns:wpi="http://schemas.microsoft.com/office/word/2010/wordprocessingInk" xmlns:wne="http://schemas.microsoft.com/office/word/2006/wordml" xmlns:wps="http://schemas.microsoft.com/office/word/2010/wordprocessingShape" xmlns:wpsCustomData="http://www.wps.cn/officeDocument/2013/wpsCustomData" mc:Ignorable="w14 w15 wp14">
   <w:body>
     <w:p>
       <w:pPr>
@@ -108,16 +108,75 @@
           <w:sz w:val="28"/>
           <w:szCs w:val="28"/>
         </w:rPr>
-        <w:t>This is to certify that plot no- {PlotNumbers}</w:t>
-      </w:r>
-      <w:r>
-        <w:rPr>
-          <w:rFonts w:hint="default" w:ascii="Calibri" w:hAnsi="Calibri"/>
-          <w:sz w:val="28"/>
-          <w:szCs w:val="28"/>
-          <w:lang w:val="en-IN"/>
-        </w:rPr>
-        <w:t xml:space="preserve">                     </w:t>
+        <w:t xml:space="preserve">This is to certify that plot no- </w:t>
+      </w:r>
+      <w:r>
+        <w:rPr>
+          <w:rFonts w:ascii="Calibri" w:hAnsi="Calibri"/>
+          <w:b/>
+          <w:bCs/>
+          <w:sz w:val="28"/>
+          <w:szCs w:val="28"/>
+        </w:rPr>
+        <w:t>{PlotNumbers}</w:t>
+      </w:r>
+      <w:r>
+        <w:rPr>
+          <w:rFonts w:hint="default" w:ascii="Calibri" w:hAnsi="Calibri"/>
+          <w:b/>
+          <w:bCs/>
+          <w:sz w:val="28"/>
+          <w:szCs w:val="28"/>
+          <w:lang w:val="en-IN"/>
+        </w:rPr>
+        <w:t xml:space="preserve"> </w:t>
+      </w:r>
+      <w:r>
+        <w:rPr>
+          <w:rFonts w:hint="default" w:ascii="Calibri" w:hAnsi="Calibri"/>
+          <w:sz w:val="28"/>
+          <w:szCs w:val="28"/>
+          <w:lang w:val="en-IN"/>
+        </w:rPr>
+        <w:t xml:space="preserve"> </w:t>
+      </w:r>
+      <w:r>
+        <w:rPr>
+          <w:rFonts w:ascii="Calibri" w:hAnsi="Calibri"/>
+          <w:sz w:val="28"/>
+          <w:szCs w:val="28"/>
+        </w:rPr>
+        <w:t xml:space="preserve">of mouza </w:t>
+      </w:r>
+      <w:r>
+        <w:rPr>
+          <w:rFonts w:ascii="Calibri" w:hAnsi="Calibri"/>
+          <w:b/>
+          <w:bCs/>
+          <w:sz w:val="28"/>
+          <w:szCs w:val="28"/>
+        </w:rPr>
+        <w:t>{MouzaName}</w:t>
+      </w:r>
+      <w:r>
+        <w:rPr>
+          <w:rFonts w:hint="default" w:ascii="Calibri" w:hAnsi="Calibri"/>
+          <w:b/>
+          <w:bCs/>
+          <w:sz w:val="28"/>
+          <w:szCs w:val="28"/>
+          <w:lang w:val="en-IN"/>
+        </w:rPr>
+        <w:t xml:space="preserve"> </w:t>
+      </w:r>
+      <w:r>
+        <w:rPr>
+          <w:rFonts w:hint="default" w:ascii="Calibri" w:hAnsi="Calibri"/>
+          <w:sz w:val="28"/>
+          <w:szCs w:val="28"/>
+          <w:lang w:val="en-IN"/>
+        </w:rPr>
+        <w:t xml:space="preserve">    </w:t>
       </w:r>
       <w:r>
         <w:rPr>
@@ -127,7 +186,6 @@
           <w:lang w:val="en-IN"/>
         </w:rPr>
         <w:tab/>
-        <w:t/>
       </w:r>
       <w:r>
         <w:rPr>
@@ -137,118 +195,30 @@
           <w:lang w:val="en-IN"/>
         </w:rPr>
         <w:tab/>
-        <w:t/>
-      </w:r>
-      <w:r>
-        <w:rPr>
-          <w:rFonts w:hint="default" w:ascii="Calibri" w:hAnsi="Calibri"/>
-          <w:sz w:val="28"/>
-          <w:szCs w:val="28"/>
-          <w:lang w:val="en-IN"/>
-        </w:rPr>
-        <w:tab/>
-        <w:t/>
-      </w:r>
-      <w:r>
-        <w:rPr>
-          <w:rFonts w:hint="default" w:ascii="Calibri" w:hAnsi="Calibri"/>
-          <w:sz w:val="28"/>
-          <w:szCs w:val="28"/>
-          <w:lang w:val="en-IN"/>
-        </w:rPr>
-        <w:tab/>
-        <w:t/>
-      </w:r>
-      <w:r>
-        <w:rPr>
-          <w:rFonts w:hint="default" w:ascii="Calibri" w:hAnsi="Calibri"/>
-          <w:sz w:val="28"/>
-          <w:szCs w:val="28"/>
-          <w:lang w:val="en-IN"/>
-        </w:rPr>
-        <w:tab/>
-      </w:r>
-      <w:r>
-        <w:rPr>
-          <w:rFonts w:ascii="Calibri" w:hAnsi="Calibri"/>
-          <w:sz w:val="28"/>
-          <w:szCs w:val="28"/>
-        </w:rPr>
-        <w:t>of mouza {MouzaName}</w:t>
-      </w:r>
-      <w:r>
-        <w:rPr>
-          <w:rFonts w:hint="default" w:ascii="Calibri" w:hAnsi="Calibri"/>
-          <w:sz w:val="28"/>
-          <w:szCs w:val="28"/>
-          <w:lang w:val="en-IN"/>
-        </w:rPr>
-        <w:t xml:space="preserve">     </w:t>
-      </w:r>
-      <w:r>
-        <w:rPr>
-          <w:rFonts w:hint="default" w:ascii="Calibri" w:hAnsi="Calibri"/>
-          <w:sz w:val="28"/>
-          <w:szCs w:val="28"/>
-          <w:lang w:val="en-IN"/>
-        </w:rPr>
-        <w:tab/>
-        <w:t/>
-      </w:r>
-      <w:r>
-        <w:rPr>
-          <w:rFonts w:hint="default" w:ascii="Calibri" w:hAnsi="Calibri"/>
-          <w:sz w:val="28"/>
-          <w:szCs w:val="28"/>
-          <w:lang w:val="en-IN"/>
-        </w:rPr>
-        <w:tab/>
-      </w:r>
-      <w:r>
-        <w:rPr>
-          <w:rFonts w:ascii="Calibri" w:hAnsi="Calibri"/>
-          <w:sz w:val="28"/>
-          <w:szCs w:val="28"/>
-        </w:rPr>
-        <w:t xml:space="preserve"> has not been acquired/ purchased by {AdjacentCollieryName}</w:t>
-      </w:r>
-      <w:r>
-        <w:rPr>
-          <w:rFonts w:hint="default" w:ascii="Calibri" w:hAnsi="Calibri"/>
-          <w:sz w:val="28"/>
-          <w:szCs w:val="28"/>
-          <w:lang w:val="en-IN"/>
-        </w:rPr>
-        <w:t xml:space="preserve">    </w:t>
-      </w:r>
-      <w:r>
-        <w:rPr>
-          <w:rFonts w:ascii="Calibri" w:hAnsi="Calibri"/>
-          <w:sz w:val="28"/>
-          <w:szCs w:val="28"/>
-        </w:rPr>
-        <w:t xml:space="preserve"> colliery, {AdjacentAreaName}</w:t>
-      </w:r>
-      <w:r>
-        <w:rPr>
-          <w:rFonts w:hint="default" w:ascii="Calibri" w:hAnsi="Calibri"/>
-          <w:sz w:val="28"/>
-          <w:szCs w:val="28"/>
-          <w:lang w:val="en-IN"/>
-        </w:rPr>
-        <w:t xml:space="preserve">    </w:t>
-      </w:r>
-      <w:r>
-        <w:rPr>
-          <w:rFonts w:ascii="Calibri" w:hAnsi="Calibri"/>
-          <w:sz w:val="28"/>
-          <w:szCs w:val="28"/>
-        </w:rPr>
-        <w:t xml:space="preserve"> Area (Name of adjacent colliery/ area having common boundary with leasehold of {AdjacentCollieryName}</w:t>
-      </w:r>
-      <w:r>
-        <w:rPr>
-          <w:rFonts w:hint="default" w:ascii="Calibri" w:hAnsi="Calibri"/>
+      </w:r>
+      <w:r>
+        <w:rPr>
+          <w:rFonts w:ascii="Calibri" w:hAnsi="Calibri"/>
+          <w:sz w:val="28"/>
+          <w:szCs w:val="28"/>
+        </w:rPr>
+        <w:t xml:space="preserve"> has not been acquired/ purchased by </w:t>
+      </w:r>
+      <w:r>
+        <w:rPr>
+          <w:rFonts w:ascii="Calibri" w:hAnsi="Calibri"/>
+          <w:b/>
+          <w:bCs/>
+          <w:sz w:val="28"/>
+          <w:szCs w:val="28"/>
+        </w:rPr>
+        <w:t>{AdjacentCollieryName}</w:t>
+      </w:r>
+      <w:r>
+        <w:rPr>
+          <w:rFonts w:hint="default" w:ascii="Calibri" w:hAnsi="Calibri"/>
+          <w:b/>
+          <w:bCs/>
           <w:sz w:val="28"/>
           <w:szCs w:val="28"/>
           <w:lang w:val="en-IN"/>
@@ -261,24 +231,79 @@
           <w:sz w:val="28"/>
           <w:szCs w:val="28"/>
         </w:rPr>
-        <w:t>colliery, {AcquiringAreaName}</w:t>
-      </w:r>
-      <w:r>
-        <w:rPr>
-          <w:rFonts w:hint="default" w:ascii="Calibri" w:hAnsi="Calibri"/>
-          <w:sz w:val="28"/>
-          <w:szCs w:val="28"/>
-          <w:lang w:val="en-IN"/>
-        </w:rPr>
-        <w:t xml:space="preserve">  </w:t>
-      </w:r>
-      <w:r>
-        <w:rPr>
-          <w:rFonts w:ascii="Calibri" w:hAnsi="Calibri"/>
-          <w:sz w:val="28"/>
-          <w:szCs w:val="28"/>
-        </w:rPr>
-        <w:t>Area) and no compensation for the above plots has been paid and/ or no R&amp;R benefit has been provided against the said plots of land by the said adjacent Colliery/ Area.</w:t>
+        <w:t xml:space="preserve">colliery, </w:t>
+      </w:r>
+      <w:r>
+        <w:rPr>
+          <w:rFonts w:ascii="Calibri" w:hAnsi="Calibri"/>
+          <w:b/>
+          <w:bCs/>
+          <w:sz w:val="28"/>
+          <w:szCs w:val="28"/>
+        </w:rPr>
+        <w:t>{AdjacentAreaName}</w:t>
+      </w:r>
+      <w:r>
+        <w:rPr>
+          <w:rFonts w:hint="default" w:ascii="Calibri" w:hAnsi="Calibri"/>
+          <w:sz w:val="28"/>
+          <w:szCs w:val="28"/>
+          <w:lang w:val="en-IN"/>
+        </w:rPr>
+        <w:t xml:space="preserve"> </w:t>
+      </w:r>
+      <w:r>
+        <w:rPr>
+          <w:rFonts w:ascii="Calibri" w:hAnsi="Calibri"/>
+          <w:sz w:val="28"/>
+          <w:szCs w:val="28"/>
+        </w:rPr>
+        <w:t xml:space="preserve">(Name of adjacent colliery/ area having common boundary with leasehold of </w:t>
+      </w:r>
+      <w:r>
+        <w:rPr>
+          <w:rFonts w:ascii="Calibri" w:hAnsi="Calibri"/>
+          <w:b/>
+          <w:bCs/>
+          <w:sz w:val="28"/>
+          <w:szCs w:val="28"/>
+        </w:rPr>
+        <w:t>{AcquiringCollieryName}</w:t>
+      </w:r>
+      <w:r>
+        <w:rPr>
+          <w:rFonts w:hint="default" w:ascii="Calibri" w:hAnsi="Calibri"/>
+          <w:sz w:val="28"/>
+          <w:szCs w:val="28"/>
+          <w:lang w:val="en-IN"/>
+        </w:rPr>
+        <w:t xml:space="preserve"> </w:t>
+      </w:r>
+      <w:r>
+        <w:rPr>
+          <w:rFonts w:ascii="Calibri" w:hAnsi="Calibri"/>
+          <w:sz w:val="28"/>
+          <w:szCs w:val="28"/>
+        </w:rPr>
+        <w:t xml:space="preserve">colliery, </w:t>
+      </w:r>
+      <w:r>
+        <w:rPr>
+          <w:rFonts w:ascii="Calibri" w:hAnsi="Calibri"/>
+          <w:b/>
+          <w:bCs/>
+          <w:sz w:val="28"/>
+          <w:szCs w:val="28"/>
+        </w:rPr>
+        <w:t>{AcquiringAreaName}</w:t>
+      </w:r>
+      <w:r>
+        <w:rPr>
+          <w:rFonts w:ascii="Calibri" w:hAnsi="Calibri"/>
+          <w:sz w:val="28"/>
+          <w:szCs w:val="28"/>
+        </w:rPr>
+        <w:t>) and no compensation for the above plots has been paid and/ or no R&amp;R benefit has been provided against the said plots of land by the said adjacent Colliery/ Area.</w:t>
       </w:r>
     </w:p>
     <w:p>
@@ -297,59 +322,64 @@
           <w:sz w:val="28"/>
           <w:szCs w:val="28"/>
         </w:rPr>
-        <w:t>The said land(s) have been acquired/ possessed by</w:t>
-      </w:r>
-      <w:r>
-        <w:rPr>
-          <w:rFonts w:hint="default" w:ascii="Calibri" w:hAnsi="Calibri"/>
-          <w:sz w:val="28"/>
-          <w:szCs w:val="28"/>
-          <w:lang w:val="en-IN"/>
-        </w:rPr>
-        <w:t xml:space="preserve">   </w:t>
-      </w:r>
-      <w:r>
-        <w:rPr>
-          <w:rFonts w:ascii="Calibri" w:hAnsi="Calibri"/>
-          <w:sz w:val="28"/>
-          <w:szCs w:val="28"/>
-        </w:rPr>
-        <w:t xml:space="preserve">{AdjacentCollieryName}Colliery, {AdjacentAreaName} </w:t>
-      </w:r>
-      <w:r>
-        <w:rPr>
-          <w:rFonts w:hint="default" w:ascii="Calibri" w:hAnsi="Calibri"/>
-          <w:sz w:val="28"/>
-          <w:szCs w:val="28"/>
-          <w:lang w:val="en-IN"/>
-        </w:rPr>
-        <w:t xml:space="preserve">     </w:t>
-      </w:r>
-      <w:r>
-        <w:rPr>
-          <w:rFonts w:ascii="Calibri" w:hAnsi="Calibri"/>
-          <w:sz w:val="28"/>
-          <w:szCs w:val="28"/>
-        </w:rPr>
-        <w:t xml:space="preserve">Area only for {AcquisitionPurpose} </w:t>
-      </w:r>
-      <w:r>
-        <w:rPr>
-          <w:rFonts w:hint="default" w:ascii="Calibri" w:hAnsi="Calibri"/>
-          <w:sz w:val="28"/>
-          <w:szCs w:val="28"/>
-          <w:lang w:val="en-IN"/>
-        </w:rPr>
-        <w:t xml:space="preserve">    </w:t>
-      </w:r>
-      <w:r>
-        <w:rPr>
-          <w:rFonts w:ascii="Calibri" w:hAnsi="Calibri"/>
-          <w:sz w:val="28"/>
-          <w:szCs w:val="28"/>
-        </w:rPr>
-        <w:t xml:space="preserve">Purpose. </w:t>
-      </w:r>
+        <w:t xml:space="preserve">The said land(s) have been acquired/ possessed by </w:t>
+      </w:r>
+      <w:r>
+        <w:rPr>
+          <w:rFonts w:ascii="Calibri" w:hAnsi="Calibri"/>
+          <w:b/>
+          <w:bCs/>
+          <w:sz w:val="28"/>
+          <w:szCs w:val="28"/>
+        </w:rPr>
+        <w:t>{AcquiringCollieryName}</w:t>
+      </w:r>
+      <w:r>
+        <w:rPr>
+          <w:rFonts w:ascii="Calibri" w:hAnsi="Calibri"/>
+          <w:sz w:val="28"/>
+          <w:szCs w:val="28"/>
+        </w:rPr>
+        <w:t xml:space="preserve"> Colliery, </w:t>
+      </w:r>
+      <w:r>
+        <w:rPr>
+          <w:rFonts w:ascii="Calibri" w:hAnsi="Calibri"/>
+          <w:b/>
+          <w:bCs/>
+          <w:sz w:val="28"/>
+          <w:szCs w:val="28"/>
+        </w:rPr>
+        <w:t>{AcquiringAreaName}</w:t>
+      </w:r>
+      <w:r>
+        <w:rPr>
+          <w:rFonts w:ascii="Calibri" w:hAnsi="Calibri"/>
+          <w:sz w:val="28"/>
+          <w:szCs w:val="28"/>
+        </w:rPr>
+        <w:t xml:space="preserve"> Area only for </w:t>
+      </w:r>
+      <w:r>
+        <w:rPr>
+          <w:rFonts w:ascii="Calibri" w:hAnsi="Calibri"/>
+          <w:b/>
+          <w:bCs/>
+          <w:sz w:val="28"/>
+          <w:szCs w:val="28"/>
+        </w:rPr>
+        <w:t>{AcquisitionPurpose}</w:t>
+      </w:r>
+      <w:r>
+        <w:rPr>
+          <w:rFonts w:ascii="Calibri" w:hAnsi="Calibri"/>
+          <w:sz w:val="28"/>
+          <w:szCs w:val="28"/>
+        </w:rPr>
+        <w:t xml:space="preserve"> Purpose.</w:t>
+      </w:r>
+      <w:bookmarkStart w:id="0" w:name="_GoBack"/>
+      <w:bookmarkEnd w:id="0"/>
     </w:p>
     <w:p>
       <w:pPr>
@@ -753,15 +783,7 @@
         <w:rPr>
           <w:rFonts w:ascii="Calibri" w:hAnsi="Calibri"/>
         </w:rPr>
-        <w:t xml:space="preserve">Land Clerk/Amin/Rev.Inspector           </w:t>
-      </w:r>
-      <w:bookmarkStart w:id="0" w:name="_GoBack"/>
-      <w:bookmarkEnd w:id="0"/>
-      <w:r>
-        <w:rPr>
-          <w:rFonts w:ascii="Calibri" w:hAnsi="Calibri"/>
-        </w:rPr>
-        <w:t>Surveyor/Survey Officer</w:t>
+        <w:t>Land Clerk/Amin/Rev.Inspector           Surveyor/Survey Officer</w:t>
       </w:r>
       <w:r>
         <w:rPr>
@@ -1097,7 +1119,7 @@
     <w:lsdException w:uiPriority="99" w:name="HTML Sample"/>
     <w:lsdException w:uiPriority="99" w:name="HTML Typewriter"/>
     <w:lsdException w:uiPriority="99" w:name="HTML Variable"/>
-    <w:lsdException w:uiPriority="99" w:name="Normal Table"/>
+    <w:lsdException w:qFormat="1" w:uiPriority="99" w:name="Normal Table"/>
     <w:lsdException w:uiPriority="99" w:name="annotation subject"/>
     <w:lsdException w:uiPriority="99" w:name="Table Simple 1"/>
     <w:lsdException w:uiPriority="99" w:name="Table Simple 2"/>
@@ -1265,6 +1287,7 @@
     <w:name w:val="Normal Table"/>
     <w:semiHidden/>
     <w:unhideWhenUsed/>
+    <w:qFormat/>
     <w:uiPriority w:val="99"/>
     <w:tblPr>
       <w:tblCellMar>

</xml_diff>

<commit_message>
Pushing updates to main and biswajit branch
</commit_message>
<xml_diff>
--- a/src/lib/engines/docx/templates/Form-VII-Template.docx
+++ b/src/lib/engines/docx/templates/Form-VII-Template.docx
@@ -378,8 +378,6 @@
         </w:rPr>
         <w:t xml:space="preserve"> Purpose.</w:t>
       </w:r>
-      <w:bookmarkStart w:id="0" w:name="_GoBack"/>
-      <w:bookmarkEnd w:id="0"/>
     </w:p>
     <w:p>
       <w:pPr>
@@ -406,244 +404,520 @@
         <w:t>Signature of the colliery purchasing or taking possession of land:</w:t>
       </w:r>
     </w:p>
+    <w:tbl>
+      <w:tblPr>
+        <w:tblStyle w:val="4"/>
+        <w:tblW w:w="0" w:type="auto"/>
+        <w:tblInd w:w="0" w:type="dxa"/>
+        <w:tblBorders>
+          <w:top w:val="single" w:color="auto" w:sz="4" w:space="0"/>
+          <w:left w:val="single" w:color="auto" w:sz="4" w:space="0"/>
+          <w:bottom w:val="single" w:color="auto" w:sz="4" w:space="0"/>
+          <w:right w:val="single" w:color="auto" w:sz="4" w:space="0"/>
+          <w:insideH w:val="single" w:color="auto" w:sz="4" w:space="0"/>
+          <w:insideV w:val="single" w:color="auto" w:sz="4" w:space="0"/>
+        </w:tblBorders>
+        <w:tblLayout w:type="autofit"/>
+        <w:tblCellMar>
+          <w:left w:w="108" w:type="dxa"/>
+          <w:right w:w="108" w:type="dxa"/>
+        </w:tblCellMar>
+      </w:tblPr>
+      <w:tblGrid>
+        <w:gridCol w:w="3185"/>
+        <w:gridCol w:w="3258"/>
+        <w:gridCol w:w="3519"/>
+      </w:tblGrid>
+      <w:tr>
+        <w:tblPrEx>
+          <w:tblBorders>
+            <w:top w:val="single" w:color="auto" w:sz="4" w:space="0"/>
+            <w:left w:val="single" w:color="auto" w:sz="4" w:space="0"/>
+            <w:bottom w:val="single" w:color="auto" w:sz="4" w:space="0"/>
+            <w:right w:val="single" w:color="auto" w:sz="4" w:space="0"/>
+            <w:insideH w:val="single" w:color="auto" w:sz="4" w:space="0"/>
+            <w:insideV w:val="single" w:color="auto" w:sz="4" w:space="0"/>
+          </w:tblBorders>
+        </w:tblPrEx>
+        <w:tc>
+          <w:tcPr>
+            <w:tcW w:w="3320" w:type="dxa"/>
+            <w:tcBorders>
+              <w:top w:val="nil"/>
+              <w:left w:val="nil"/>
+              <w:bottom w:val="nil"/>
+              <w:right w:val="nil"/>
+              <w:tl2br w:val="nil"/>
+            </w:tcBorders>
+            <w:shd w:val="clear" w:color="auto" w:fill="FFFFFF"/>
+          </w:tcPr>
+          <w:p>
+            <w:pPr>
+              <w:spacing w:line="360" w:lineRule="auto"/>
+              <w:jc w:val="both"/>
+              <w:rPr>
+                <w:rFonts w:ascii="Calibri" w:hAnsi="Calibri"/>
+                <w:b/>
+                <w:bCs w:val="0"/>
+                <w:i/>
+                <w:iCs/>
+                <w:color w:val="000000"/>
+                <w:sz w:val="18"/>
+                <w:szCs w:val="18"/>
+                <w:u w:val="none"/>
+              </w:rPr>
+            </w:pPr>
+            <w:r>
+              <w:rPr>
+                <w:rFonts w:ascii="Calibri" w:hAnsi="Calibri"/>
+                <w:b/>
+                <w:bCs w:val="0"/>
+                <w:i/>
+                <w:iCs/>
+                <w:color w:val="000000"/>
+                <w:sz w:val="18"/>
+                <w:szCs w:val="18"/>
+                <w:u w:val="none"/>
+              </w:rPr>
+              <w:t>{PurchasingLandClerkSignature}</w:t>
+            </w:r>
+          </w:p>
+          <w:p>
+            <w:pPr>
+              <w:spacing w:line="360" w:lineRule="auto"/>
+              <w:jc w:val="both"/>
+              <w:rPr>
+                <w:rFonts w:ascii="Calibri" w:hAnsi="Calibri"/>
+                <w:b w:val="0"/>
+                <w:color w:val="000000"/>
+                <w:sz w:val="21"/>
+                <w:szCs w:val="21"/>
+                <w:u w:val="single"/>
+              </w:rPr>
+            </w:pPr>
+            <w:r>
+              <w:rPr>
+                <w:rFonts w:ascii="Calibri" w:hAnsi="Calibri"/>
+                <w:b w:val="0"/>
+                <w:color w:val="000000"/>
+                <w:sz w:val="21"/>
+                <w:szCs w:val="21"/>
+              </w:rPr>
+              <w:t xml:space="preserve">Land Clerk/Amin/Rev.Inspector   </w:t>
+            </w:r>
+          </w:p>
+        </w:tc>
+        <w:tc>
+          <w:tcPr>
+            <w:tcW w:w="3321" w:type="dxa"/>
+            <w:tcBorders>
+              <w:top w:val="nil"/>
+              <w:left w:val="nil"/>
+              <w:bottom w:val="nil"/>
+              <w:right w:val="nil"/>
+            </w:tcBorders>
+            <w:shd w:val="clear" w:color="auto" w:fill="FFFFFF"/>
+          </w:tcPr>
+          <w:p>
+            <w:pPr>
+              <w:spacing w:line="360" w:lineRule="auto"/>
+              <w:jc w:val="both"/>
+              <w:rPr>
+                <w:rFonts w:ascii="Calibri" w:hAnsi="Calibri"/>
+                <w:b/>
+                <w:bCs w:val="0"/>
+                <w:i/>
+                <w:iCs/>
+                <w:color w:val="000000"/>
+                <w:sz w:val="18"/>
+                <w:szCs w:val="18"/>
+                <w:u w:val="none"/>
+              </w:rPr>
+            </w:pPr>
+            <w:r>
+              <w:rPr>
+                <w:rFonts w:ascii="Calibri" w:hAnsi="Calibri"/>
+                <w:b/>
+                <w:bCs w:val="0"/>
+                <w:i/>
+                <w:iCs/>
+                <w:color w:val="000000"/>
+                <w:sz w:val="18"/>
+                <w:szCs w:val="18"/>
+                <w:u w:val="none"/>
+              </w:rPr>
+              <w:t>{PurchasingSurveyOfficerSignature}</w:t>
+            </w:r>
+          </w:p>
+          <w:p>
+            <w:pPr>
+              <w:spacing w:line="360" w:lineRule="auto"/>
+              <w:jc w:val="both"/>
+              <w:rPr>
+                <w:rFonts w:ascii="Calibri" w:hAnsi="Calibri"/>
+                <w:b w:val="0"/>
+                <w:color w:val="000000"/>
+                <w:sz w:val="21"/>
+                <w:szCs w:val="21"/>
+                <w:u w:val="single"/>
+              </w:rPr>
+            </w:pPr>
+            <w:r>
+              <w:rPr>
+                <w:rFonts w:ascii="Calibri" w:hAnsi="Calibri"/>
+                <w:b w:val="0"/>
+                <w:color w:val="000000"/>
+                <w:sz w:val="21"/>
+                <w:szCs w:val="21"/>
+              </w:rPr>
+              <w:t xml:space="preserve"> Surveyor/Survey Officer</w:t>
+            </w:r>
+          </w:p>
+        </w:tc>
+        <w:tc>
+          <w:tcPr>
+            <w:tcW w:w="3321" w:type="dxa"/>
+            <w:tcBorders>
+              <w:top w:val="nil"/>
+              <w:left w:val="nil"/>
+              <w:bottom w:val="nil"/>
+              <w:right w:val="nil"/>
+            </w:tcBorders>
+            <w:shd w:val="clear" w:color="auto" w:fill="FFFFFF"/>
+          </w:tcPr>
+          <w:p>
+            <w:pPr>
+              <w:spacing w:line="360" w:lineRule="auto"/>
+              <w:jc w:val="both"/>
+              <w:rPr>
+                <w:rFonts w:ascii="Calibri" w:hAnsi="Calibri"/>
+                <w:b/>
+                <w:bCs w:val="0"/>
+                <w:i/>
+                <w:iCs/>
+                <w:color w:val="000000"/>
+                <w:sz w:val="18"/>
+                <w:szCs w:val="18"/>
+                <w:u w:val="none"/>
+              </w:rPr>
+            </w:pPr>
+            <w:r>
+              <w:rPr>
+                <w:rFonts w:ascii="Calibri" w:hAnsi="Calibri"/>
+                <w:b/>
+                <w:bCs w:val="0"/>
+                <w:i/>
+                <w:iCs/>
+                <w:color w:val="000000"/>
+                <w:sz w:val="18"/>
+                <w:szCs w:val="18"/>
+                <w:u w:val="none"/>
+              </w:rPr>
+              <w:t>{PurchasingProjectManagerSignature}</w:t>
+            </w:r>
+          </w:p>
+          <w:p>
+            <w:pPr>
+              <w:spacing w:line="360" w:lineRule="auto"/>
+              <w:jc w:val="both"/>
+              <w:rPr>
+                <w:rFonts w:ascii="Calibri" w:hAnsi="Calibri"/>
+                <w:b w:val="0"/>
+                <w:color w:val="000000"/>
+                <w:sz w:val="21"/>
+                <w:szCs w:val="21"/>
+                <w:u w:val="single"/>
+              </w:rPr>
+            </w:pPr>
+            <w:r>
+              <w:rPr>
+                <w:rFonts w:ascii="Calibri" w:hAnsi="Calibri"/>
+                <w:b w:val="0"/>
+                <w:color w:val="000000"/>
+                <w:sz w:val="21"/>
+                <w:szCs w:val="21"/>
+              </w:rPr>
+              <w:t>Colliery/Project Manager</w:t>
+            </w:r>
+          </w:p>
+        </w:tc>
+      </w:tr>
+      <w:tr>
+        <w:tblPrEx>
+          <w:tblBorders>
+            <w:top w:val="single" w:color="auto" w:sz="4" w:space="0"/>
+            <w:left w:val="single" w:color="auto" w:sz="4" w:space="0"/>
+            <w:bottom w:val="single" w:color="auto" w:sz="4" w:space="0"/>
+            <w:right w:val="single" w:color="auto" w:sz="4" w:space="0"/>
+            <w:insideH w:val="single" w:color="auto" w:sz="4" w:space="0"/>
+            <w:insideV w:val="single" w:color="auto" w:sz="4" w:space="0"/>
+          </w:tblBorders>
+          <w:tblCellMar>
+            <w:left w:w="108" w:type="dxa"/>
+            <w:right w:w="108" w:type="dxa"/>
+          </w:tblCellMar>
+        </w:tblPrEx>
+        <w:tc>
+          <w:tcPr>
+            <w:tcW w:w="3320" w:type="dxa"/>
+            <w:tcBorders>
+              <w:top w:val="nil"/>
+              <w:left w:val="nil"/>
+              <w:bottom w:val="nil"/>
+              <w:right w:val="nil"/>
+            </w:tcBorders>
+            <w:shd w:val="clear" w:color="auto" w:fill="FFFFFF"/>
+          </w:tcPr>
+          <w:p>
+            <w:pPr>
+              <w:spacing w:line="360" w:lineRule="auto"/>
+              <w:jc w:val="both"/>
+              <w:rPr>
+                <w:rFonts w:ascii="Calibri" w:hAnsi="Calibri"/>
+                <w:b/>
+                <w:bCs w:val="0"/>
+                <w:i/>
+                <w:iCs/>
+                <w:color w:val="000000"/>
+                <w:sz w:val="18"/>
+                <w:szCs w:val="18"/>
+                <w:u w:val="none"/>
+              </w:rPr>
+            </w:pPr>
+            <w:r>
+              <w:rPr>
+                <w:rFonts w:ascii="Calibri" w:hAnsi="Calibri"/>
+                <w:b/>
+                <w:bCs w:val="0"/>
+                <w:i/>
+                <w:iCs/>
+                <w:color w:val="000000"/>
+                <w:sz w:val="18"/>
+                <w:szCs w:val="18"/>
+                <w:u w:val="none"/>
+              </w:rPr>
+              <w:t>{PurchasingProjectAgentSignature}</w:t>
+            </w:r>
+          </w:p>
+          <w:p>
+            <w:pPr>
+              <w:spacing w:line="360" w:lineRule="auto"/>
+              <w:jc w:val="both"/>
+              <w:rPr>
+                <w:rFonts w:ascii="Calibri" w:hAnsi="Calibri"/>
+                <w:b w:val="0"/>
+                <w:color w:val="000000"/>
+                <w:sz w:val="21"/>
+                <w:szCs w:val="21"/>
+                <w:u w:val="none"/>
+              </w:rPr>
+            </w:pPr>
+            <w:r>
+              <w:rPr>
+                <w:rFonts w:ascii="Calibri" w:hAnsi="Calibri"/>
+                <w:b w:val="0"/>
+                <w:color w:val="000000"/>
+                <w:sz w:val="21"/>
+                <w:szCs w:val="21"/>
+              </w:rPr>
+              <w:t>Colliery/Project Agent</w:t>
+            </w:r>
+          </w:p>
+        </w:tc>
+        <w:tc>
+          <w:tcPr>
+            <w:tcW w:w="3321" w:type="dxa"/>
+            <w:tcBorders>
+              <w:top w:val="nil"/>
+              <w:left w:val="nil"/>
+              <w:bottom w:val="nil"/>
+              <w:right w:val="nil"/>
+            </w:tcBorders>
+            <w:shd w:val="clear" w:color="auto" w:fill="FFFFFF"/>
+          </w:tcPr>
+          <w:p>
+            <w:pPr>
+              <w:spacing w:line="360" w:lineRule="auto"/>
+              <w:jc w:val="both"/>
+              <w:rPr>
+                <w:rFonts w:hint="default" w:ascii="Calibri" w:hAnsi="Calibri"/>
+                <w:b/>
+                <w:bCs/>
+                <w:i/>
+                <w:iCs/>
+                <w:color w:val="000000"/>
+                <w:sz w:val="18"/>
+                <w:szCs w:val="18"/>
+                <w:u w:val="none"/>
+                <w:lang w:val="en-IN"/>
+              </w:rPr>
+            </w:pPr>
+            <w:r>
+              <w:rPr>
+                <w:rFonts w:hint="default" w:ascii="Calibri" w:hAnsi="Calibri"/>
+                <w:b/>
+                <w:bCs/>
+                <w:i/>
+                <w:iCs/>
+                <w:color w:val="000000"/>
+                <w:sz w:val="18"/>
+                <w:szCs w:val="18"/>
+                <w:u w:val="none"/>
+                <w:lang w:val="en-IN"/>
+              </w:rPr>
+              <w:t xml:space="preserve"> </w:t>
+            </w:r>
+            <w:r>
+              <w:rPr>
+                <w:rFonts w:hint="default" w:ascii="Calibri" w:hAnsi="Calibri"/>
+                <w:b/>
+                <w:bCs/>
+                <w:i/>
+                <w:iCs/>
+                <w:color w:val="000000"/>
+                <w:sz w:val="18"/>
+                <w:szCs w:val="18"/>
+                <w:u w:val="none"/>
+                <w:lang w:val="en-IN"/>
+              </w:rPr>
+              <w:t>{PurchasingAreaLandOfficerSignature}</w:t>
+            </w:r>
+          </w:p>
+          <w:p>
+            <w:pPr>
+              <w:spacing w:line="360" w:lineRule="auto"/>
+              <w:jc w:val="both"/>
+              <w:rPr>
+                <w:rFonts w:ascii="Calibri" w:hAnsi="Calibri"/>
+                <w:b w:val="0"/>
+                <w:color w:val="000000"/>
+                <w:sz w:val="21"/>
+                <w:szCs w:val="21"/>
+                <w:vertAlign w:val="baseline"/>
+              </w:rPr>
+            </w:pPr>
+            <w:r>
+              <w:rPr>
+                <w:rFonts w:ascii="Calibri" w:hAnsi="Calibri"/>
+                <w:b w:val="0"/>
+                <w:color w:val="000000"/>
+                <w:sz w:val="21"/>
+                <w:szCs w:val="21"/>
+              </w:rPr>
+              <w:t xml:space="preserve">Area Land Dealing Officer </w:t>
+            </w:r>
+          </w:p>
+        </w:tc>
+        <w:tc>
+          <w:tcPr>
+            <w:tcW w:w="3321" w:type="dxa"/>
+            <w:tcBorders>
+              <w:top w:val="nil"/>
+              <w:left w:val="nil"/>
+              <w:bottom w:val="nil"/>
+              <w:right w:val="nil"/>
+            </w:tcBorders>
+            <w:shd w:val="clear" w:color="auto" w:fill="FFFFFF"/>
+          </w:tcPr>
+          <w:p>
+            <w:pPr>
+              <w:spacing w:line="360" w:lineRule="auto"/>
+              <w:jc w:val="both"/>
+              <w:rPr>
+                <w:rFonts w:hint="default" w:ascii="Calibri" w:hAnsi="Calibri"/>
+                <w:b/>
+                <w:bCs w:val="0"/>
+                <w:i/>
+                <w:iCs/>
+                <w:color w:val="000000"/>
+                <w:sz w:val="18"/>
+                <w:szCs w:val="18"/>
+                <w:u w:val="none"/>
+                <w:lang w:val="en-IN"/>
+              </w:rPr>
+            </w:pPr>
+            <w:r>
+              <w:rPr>
+                <w:rFonts w:hint="default" w:ascii="Calibri" w:hAnsi="Calibri"/>
+                <w:b/>
+                <w:bCs w:val="0"/>
+                <w:i/>
+                <w:iCs/>
+                <w:color w:val="000000"/>
+                <w:sz w:val="18"/>
+                <w:szCs w:val="18"/>
+                <w:u w:val="none"/>
+                <w:lang w:val="en-IN"/>
+              </w:rPr>
+              <w:t>{PurchasingAreaGeneralManagerSignature}</w:t>
+            </w:r>
+          </w:p>
+          <w:p>
+            <w:pPr>
+              <w:spacing w:line="360" w:lineRule="auto"/>
+              <w:jc w:val="both"/>
+              <w:rPr>
+                <w:rFonts w:hint="default" w:ascii="Calibri" w:hAnsi="Calibri"/>
+                <w:b w:val="0"/>
+                <w:color w:val="000000"/>
+                <w:sz w:val="21"/>
+                <w:szCs w:val="21"/>
+                <w:u w:val="none"/>
+                <w:lang w:val="en-IN"/>
+              </w:rPr>
+            </w:pPr>
+            <w:r>
+              <w:rPr>
+                <w:rFonts w:ascii="Calibri" w:hAnsi="Calibri"/>
+                <w:b w:val="0"/>
+                <w:color w:val="000000"/>
+                <w:sz w:val="21"/>
+                <w:szCs w:val="21"/>
+              </w:rPr>
+              <w:t>Area</w:t>
+            </w:r>
+            <w:r>
+              <w:rPr>
+                <w:rFonts w:ascii="Calibri" w:hAnsi="Calibri"/>
+                <w:b w:val="0"/>
+                <w:bCs/>
+                <w:color w:val="000000"/>
+                <w:sz w:val="21"/>
+                <w:szCs w:val="21"/>
+              </w:rPr>
+              <w:t xml:space="preserve"> </w:t>
+            </w:r>
+            <w:r>
+              <w:rPr>
+                <w:rFonts w:ascii="Calibri" w:hAnsi="Calibri"/>
+                <w:b w:val="0"/>
+                <w:color w:val="000000"/>
+                <w:sz w:val="21"/>
+                <w:szCs w:val="21"/>
+              </w:rPr>
+              <w:t xml:space="preserve">General Manager </w:t>
+            </w:r>
+          </w:p>
+        </w:tc>
+      </w:tr>
+    </w:tbl>
     <w:p>
       <w:pPr>
-        <w:spacing w:line="360" w:lineRule="auto"/>
-        <w:jc w:val="both"/>
-        <w:rPr>
-          <w:rFonts w:ascii="Calibri" w:hAnsi="Calibri"/>
-          <w:sz w:val="28"/>
-          <w:szCs w:val="28"/>
+        <w:rPr>
+          <w:rFonts w:ascii="Calibri" w:hAnsi="Calibri"/>
+          <w:b/>
+          <w:bCs/>
+          <w:sz w:val="16"/>
+          <w:szCs w:val="16"/>
+          <w:u w:val="single"/>
         </w:rPr>
       </w:pPr>
-    </w:p>
-    <w:p>
-      <w:pPr>
-        <w:rPr>
-          <w:rFonts w:ascii="Calibri" w:hAnsi="Calibri"/>
-        </w:rPr>
-      </w:pPr>
-      <w:r>
-        <w:rPr>
-          <w:rFonts w:ascii="Calibri" w:hAnsi="Calibri"/>
-          <w:sz w:val="21"/>
-          <w:szCs w:val="21"/>
-          <w:u w:val="single"/>
-        </w:rPr>
-        <w:t>{PurchasingLandClerkSignature}</w:t>
-      </w:r>
-      <w:r>
-        <w:rPr>
-          <w:rFonts w:ascii="Calibri" w:hAnsi="Calibri"/>
-        </w:rPr>
-        <w:tab/>
-      </w:r>
-      <w:r>
-        <w:rPr>
-          <w:rFonts w:ascii="Calibri" w:hAnsi="Calibri"/>
-        </w:rPr>
-        <w:t xml:space="preserve">    </w:t>
-      </w:r>
-      <w:r>
-        <w:rPr>
-          <w:rFonts w:ascii="Calibri" w:hAnsi="Calibri"/>
-          <w:sz w:val="21"/>
-          <w:szCs w:val="21"/>
-          <w:u w:val="single"/>
-        </w:rPr>
-        <w:t>{PurchasingSurveyOfficerSignature}</w:t>
-      </w:r>
-      <w:r>
-        <w:rPr>
-          <w:rFonts w:ascii="Calibri" w:hAnsi="Calibri"/>
-          <w:u w:val="single"/>
-        </w:rPr>
-        <w:t xml:space="preserve"> </w:t>
-      </w:r>
-      <w:r>
-        <w:rPr>
-          <w:rFonts w:ascii="Calibri" w:hAnsi="Calibri"/>
-        </w:rPr>
-        <w:t xml:space="preserve">   </w:t>
-      </w:r>
-      <w:r>
-        <w:rPr>
-          <w:rFonts w:hint="default" w:ascii="Calibri" w:hAnsi="Calibri"/>
-          <w:lang w:val="en-IN"/>
-        </w:rPr>
-        <w:t xml:space="preserve"> </w:t>
-      </w:r>
-      <w:r>
-        <w:rPr>
-          <w:rFonts w:ascii="Calibri" w:hAnsi="Calibri"/>
-        </w:rPr>
-        <w:t xml:space="preserve"> </w:t>
-      </w:r>
-      <w:r>
-        <w:rPr>
-          <w:rFonts w:ascii="Calibri" w:hAnsi="Calibri"/>
-          <w:sz w:val="21"/>
-          <w:szCs w:val="21"/>
-          <w:u w:val="single"/>
-        </w:rPr>
-        <w:t>{PurchasingProjectManagerSignature}</w:t>
-      </w:r>
-    </w:p>
-    <w:p>
-      <w:pPr>
-        <w:rPr>
-          <w:rFonts w:ascii="Calibri" w:hAnsi="Calibri"/>
-        </w:rPr>
-      </w:pPr>
-      <w:r>
-        <w:rPr>
-          <w:rFonts w:ascii="Calibri" w:hAnsi="Calibri"/>
-        </w:rPr>
-        <w:t>Land Clerk/Amin/Rev.Inspector               Surveyor/Survey Officer</w:t>
-      </w:r>
-      <w:r>
-        <w:rPr>
-          <w:rFonts w:ascii="Calibri" w:hAnsi="Calibri"/>
-        </w:rPr>
-        <w:tab/>
-      </w:r>
-      <w:r>
-        <w:rPr>
-          <w:rFonts w:ascii="Calibri" w:hAnsi="Calibri"/>
-        </w:rPr>
-        <w:t xml:space="preserve">          Colliery/Project Manager</w:t>
-      </w:r>
-    </w:p>
-    <w:p>
-      <w:pPr>
-        <w:rPr>
-          <w:rFonts w:ascii="Calibri" w:hAnsi="Calibri"/>
-          <w:sz w:val="2"/>
-          <w:szCs w:val="2"/>
-        </w:rPr>
-      </w:pPr>
-    </w:p>
-    <w:p>
-      <w:pPr>
-        <w:rPr>
-          <w:rFonts w:ascii="Calibri" w:hAnsi="Calibri"/>
-        </w:rPr>
-      </w:pPr>
-    </w:p>
-    <w:p>
-      <w:pPr>
-        <w:rPr>
-          <w:rFonts w:ascii="Calibri" w:hAnsi="Calibri"/>
-        </w:rPr>
-      </w:pPr>
-    </w:p>
-    <w:p>
-      <w:pPr>
-        <w:rPr>
-          <w:rFonts w:hint="default" w:ascii="Calibri" w:hAnsi="Calibri"/>
-          <w:sz w:val="21"/>
-          <w:szCs w:val="21"/>
-          <w:u w:val="none"/>
-          <w:lang w:val="en-IN"/>
-        </w:rPr>
-      </w:pPr>
-      <w:r>
-        <w:rPr>
-          <w:rFonts w:ascii="Calibri" w:hAnsi="Calibri"/>
-        </w:rPr>
-        <w:t xml:space="preserve"> </w:t>
-      </w:r>
-      <w:r>
-        <w:rPr>
-          <w:rFonts w:ascii="Calibri" w:hAnsi="Calibri"/>
-          <w:sz w:val="20"/>
-          <w:szCs w:val="20"/>
-          <w:u w:val="none"/>
-        </w:rPr>
-        <w:t>{PurchasingProjectAgentSignature}</w:t>
-      </w:r>
-      <w:r>
-        <w:rPr>
-          <w:rFonts w:hint="default" w:ascii="Calibri" w:hAnsi="Calibri"/>
-          <w:sz w:val="21"/>
-          <w:szCs w:val="21"/>
-          <w:u w:val="none"/>
-          <w:lang w:val="en-IN"/>
-        </w:rPr>
-        <w:t xml:space="preserve">   </w:t>
-      </w:r>
-      <w:r>
-        <w:rPr>
-          <w:rFonts w:hint="default" w:ascii="Calibri" w:hAnsi="Calibri"/>
-          <w:sz w:val="20"/>
-          <w:szCs w:val="20"/>
-          <w:u w:val="none"/>
-          <w:lang w:val="en-IN"/>
-        </w:rPr>
-        <w:t>{PurchasingAreaLandOfficerSignature} {PurchasingAreaGeneralManagerSignature}</w:t>
-      </w:r>
-    </w:p>
-    <w:p>
-      <w:pPr>
-        <w:ind w:firstLine="120" w:firstLineChars="50"/>
-        <w:rPr>
-          <w:rFonts w:ascii="Calibri" w:hAnsi="Calibri"/>
-        </w:rPr>
-      </w:pPr>
-      <w:r>
-        <w:rPr>
-          <w:rFonts w:ascii="Calibri" w:hAnsi="Calibri"/>
-        </w:rPr>
-        <w:t>Colliery/Project Agent</w:t>
-      </w:r>
-      <w:r>
-        <w:rPr>
-          <w:rFonts w:ascii="Calibri" w:hAnsi="Calibri"/>
-        </w:rPr>
-        <w:tab/>
-      </w:r>
-      <w:r>
-        <w:rPr>
-          <w:rFonts w:ascii="Calibri" w:hAnsi="Calibri"/>
-        </w:rPr>
-        <w:t xml:space="preserve">   </w:t>
-      </w:r>
-      <w:r>
-        <w:rPr>
-          <w:rFonts w:hint="default" w:ascii="Calibri" w:hAnsi="Calibri"/>
-          <w:lang w:val="en-IN"/>
-        </w:rPr>
-        <w:t xml:space="preserve">       </w:t>
-      </w:r>
-      <w:r>
-        <w:rPr>
-          <w:rFonts w:ascii="Calibri" w:hAnsi="Calibri"/>
-        </w:rPr>
-        <w:t>Area Land Dealing Officer                      Area</w:t>
-      </w:r>
-      <w:r>
-        <w:rPr>
-          <w:rFonts w:ascii="Calibri" w:hAnsi="Calibri"/>
-          <w:b/>
-          <w:bCs/>
-        </w:rPr>
-        <w:t xml:space="preserve"> </w:t>
-      </w:r>
-      <w:r>
-        <w:rPr>
-          <w:rFonts w:ascii="Calibri" w:hAnsi="Calibri"/>
-        </w:rPr>
-        <w:t xml:space="preserve">General Manager     </w:t>
-      </w:r>
-    </w:p>
-    <w:p>
-      <w:pPr>
-        <w:rPr>
-          <w:rFonts w:ascii="Calibri" w:hAnsi="Calibri"/>
-          <w:sz w:val="20"/>
-          <w:szCs w:val="20"/>
-        </w:rPr>
-      </w:pPr>
+      <w:r>
+        <w:rPr>
+          <w:rFonts w:ascii="Calibri" w:hAnsi="Calibri"/>
+        </w:rPr>
+        <w:t xml:space="preserve">          </w:t>
+      </w:r>
     </w:p>
     <w:p>
       <w:pPr>
@@ -653,325 +927,684 @@
           <w:rFonts w:ascii="Calibri" w:hAnsi="Calibri"/>
           <w:b/>
           <w:bCs/>
-          <w:sz w:val="16"/>
-          <w:szCs w:val="16"/>
+          <w:sz w:val="28"/>
+          <w:szCs w:val="28"/>
           <w:u w:val="single"/>
         </w:rPr>
       </w:pPr>
+      <w:r>
+        <w:rPr>
+          <w:rFonts w:ascii="Calibri" w:hAnsi="Calibri"/>
+          <w:b/>
+          <w:bCs/>
+          <w:sz w:val="28"/>
+          <w:szCs w:val="28"/>
+          <w:u w:val="single"/>
+        </w:rPr>
+        <w:t>Signature of the adjacent colliery/ Area:</w:t>
+      </w:r>
+    </w:p>
+    <w:tbl>
+      <w:tblPr>
+        <w:tblStyle w:val="4"/>
+        <w:tblW w:w="0" w:type="auto"/>
+        <w:tblInd w:w="0" w:type="dxa"/>
+        <w:tblBorders>
+          <w:top w:val="single" w:color="auto" w:sz="4" w:space="0"/>
+          <w:left w:val="single" w:color="auto" w:sz="4" w:space="0"/>
+          <w:bottom w:val="single" w:color="auto" w:sz="4" w:space="0"/>
+          <w:right w:val="single" w:color="auto" w:sz="4" w:space="0"/>
+          <w:insideH w:val="single" w:color="auto" w:sz="4" w:space="0"/>
+          <w:insideV w:val="single" w:color="auto" w:sz="4" w:space="0"/>
+        </w:tblBorders>
+        <w:tblLayout w:type="autofit"/>
+        <w:tblCellMar>
+          <w:top w:w="0" w:type="dxa"/>
+          <w:left w:w="108" w:type="dxa"/>
+          <w:bottom w:w="0" w:type="dxa"/>
+          <w:right w:w="108" w:type="dxa"/>
+        </w:tblCellMar>
+      </w:tblPr>
+      <w:tblGrid>
+        <w:gridCol w:w="3295"/>
+        <w:gridCol w:w="3306"/>
+        <w:gridCol w:w="3361"/>
+      </w:tblGrid>
+      <w:tr>
+        <w:tblPrEx>
+          <w:tblBorders>
+            <w:top w:val="single" w:color="auto" w:sz="4" w:space="0"/>
+            <w:left w:val="single" w:color="auto" w:sz="4" w:space="0"/>
+            <w:bottom w:val="single" w:color="auto" w:sz="4" w:space="0"/>
+            <w:right w:val="single" w:color="auto" w:sz="4" w:space="0"/>
+            <w:insideH w:val="single" w:color="auto" w:sz="4" w:space="0"/>
+            <w:insideV w:val="single" w:color="auto" w:sz="4" w:space="0"/>
+          </w:tblBorders>
+          <w:tblCellMar>
+            <w:top w:w="0" w:type="dxa"/>
+            <w:left w:w="108" w:type="dxa"/>
+            <w:bottom w:w="0" w:type="dxa"/>
+            <w:right w:w="108" w:type="dxa"/>
+          </w:tblCellMar>
+        </w:tblPrEx>
+        <w:tc>
+          <w:tcPr>
+            <w:tcW w:w="3320" w:type="dxa"/>
+            <w:tcBorders>
+              <w:top w:val="nil"/>
+              <w:left w:val="nil"/>
+              <w:bottom w:val="nil"/>
+              <w:right w:val="nil"/>
+              <w:tl2br w:val="nil"/>
+            </w:tcBorders>
+            <w:shd w:val="clear" w:color="auto" w:fill="FFFFFF"/>
+          </w:tcPr>
+          <w:p>
+            <w:pPr>
+              <w:spacing w:line="360" w:lineRule="auto"/>
+              <w:jc w:val="both"/>
+              <w:rPr>
+                <w:rFonts w:ascii="Calibri" w:hAnsi="Calibri"/>
+                <w:b/>
+                <w:bCs/>
+                <w:i/>
+                <w:iCs/>
+                <w:sz w:val="18"/>
+                <w:szCs w:val="18"/>
+                <w:u w:val="none"/>
+              </w:rPr>
+            </w:pPr>
+            <w:r>
+              <w:rPr>
+                <w:rFonts w:ascii="Calibri" w:hAnsi="Calibri"/>
+                <w:b/>
+                <w:bCs/>
+                <w:i/>
+                <w:iCs/>
+                <w:sz w:val="18"/>
+                <w:szCs w:val="18"/>
+                <w:u w:val="none"/>
+              </w:rPr>
+              <w:t>{AdjacentLandClerkSignature}</w:t>
+            </w:r>
+          </w:p>
+          <w:p>
+            <w:pPr>
+              <w:spacing w:line="360" w:lineRule="auto"/>
+              <w:jc w:val="both"/>
+              <w:rPr>
+                <w:rFonts w:ascii="Calibri" w:hAnsi="Calibri"/>
+                <w:b w:val="0"/>
+                <w:color w:val="000000"/>
+                <w:sz w:val="21"/>
+                <w:szCs w:val="21"/>
+                <w:u w:val="single"/>
+              </w:rPr>
+            </w:pPr>
+            <w:r>
+              <w:rPr>
+                <w:rFonts w:hint="default" w:ascii="Calibri" w:hAnsi="Calibri"/>
+                <w:b w:val="0"/>
+                <w:color w:val="000000"/>
+                <w:sz w:val="21"/>
+                <w:szCs w:val="21"/>
+              </w:rPr>
+              <w:t xml:space="preserve">Land Clerk/Amin/Rev.Inspector </w:t>
+            </w:r>
+            <w:r>
+              <w:rPr>
+                <w:rFonts w:ascii="Calibri" w:hAnsi="Calibri"/>
+                <w:b w:val="0"/>
+                <w:color w:val="000000"/>
+                <w:sz w:val="21"/>
+                <w:szCs w:val="21"/>
+              </w:rPr>
+              <w:t xml:space="preserve">  </w:t>
+            </w:r>
+          </w:p>
+        </w:tc>
+        <w:tc>
+          <w:tcPr>
+            <w:tcW w:w="3321" w:type="dxa"/>
+            <w:tcBorders>
+              <w:top w:val="nil"/>
+              <w:left w:val="nil"/>
+              <w:bottom w:val="nil"/>
+              <w:right w:val="nil"/>
+            </w:tcBorders>
+            <w:shd w:val="clear" w:color="auto" w:fill="FFFFFF"/>
+          </w:tcPr>
+          <w:p>
+            <w:pPr>
+              <w:spacing w:line="360" w:lineRule="auto"/>
+              <w:jc w:val="both"/>
+              <w:rPr>
+                <w:rFonts w:ascii="Calibri" w:hAnsi="Calibri"/>
+                <w:b/>
+                <w:bCs w:val="0"/>
+                <w:i/>
+                <w:iCs/>
+                <w:color w:val="000000"/>
+                <w:sz w:val="18"/>
+                <w:szCs w:val="18"/>
+                <w:u w:val="none"/>
+              </w:rPr>
+            </w:pPr>
+            <w:r>
+              <w:rPr>
+                <w:rFonts w:ascii="Calibri" w:hAnsi="Calibri"/>
+                <w:b/>
+                <w:bCs w:val="0"/>
+                <w:i/>
+                <w:iCs/>
+                <w:color w:val="000000"/>
+                <w:sz w:val="18"/>
+                <w:szCs w:val="18"/>
+                <w:u w:val="none"/>
+              </w:rPr>
+              <w:t>{</w:t>
+            </w:r>
+            <w:r>
+              <w:rPr>
+                <w:rFonts w:ascii="Calibri" w:hAnsi="Calibri"/>
+                <w:b/>
+                <w:bCs w:val="0"/>
+                <w:i/>
+                <w:iCs/>
+                <w:sz w:val="18"/>
+                <w:szCs w:val="18"/>
+                <w:u w:val="none"/>
+              </w:rPr>
+              <w:t>AdjacentSurveyOfficerSignature</w:t>
+            </w:r>
+            <w:r>
+              <w:rPr>
+                <w:rFonts w:ascii="Calibri" w:hAnsi="Calibri"/>
+                <w:b/>
+                <w:bCs w:val="0"/>
+                <w:i/>
+                <w:iCs/>
+                <w:color w:val="000000"/>
+                <w:sz w:val="18"/>
+                <w:szCs w:val="18"/>
+                <w:u w:val="none"/>
+              </w:rPr>
+              <w:t>}</w:t>
+            </w:r>
+          </w:p>
+          <w:p>
+            <w:pPr>
+              <w:spacing w:line="360" w:lineRule="auto"/>
+              <w:jc w:val="both"/>
+              <w:rPr>
+                <w:rFonts w:ascii="Calibri" w:hAnsi="Calibri"/>
+                <w:b w:val="0"/>
+                <w:color w:val="000000"/>
+                <w:sz w:val="21"/>
+                <w:szCs w:val="21"/>
+                <w:u w:val="single"/>
+              </w:rPr>
+            </w:pPr>
+            <w:r>
+              <w:rPr>
+                <w:rFonts w:ascii="Calibri" w:hAnsi="Calibri"/>
+                <w:b w:val="0"/>
+                <w:color w:val="000000"/>
+                <w:sz w:val="21"/>
+                <w:szCs w:val="21"/>
+              </w:rPr>
+              <w:t xml:space="preserve"> Surveyor/Survey Officer</w:t>
+            </w:r>
+          </w:p>
+        </w:tc>
+        <w:tc>
+          <w:tcPr>
+            <w:tcW w:w="3321" w:type="dxa"/>
+            <w:tcBorders>
+              <w:top w:val="nil"/>
+              <w:left w:val="nil"/>
+              <w:bottom w:val="nil"/>
+              <w:right w:val="nil"/>
+            </w:tcBorders>
+            <w:shd w:val="clear" w:color="auto" w:fill="FFFFFF"/>
+          </w:tcPr>
+          <w:p>
+            <w:pPr>
+              <w:spacing w:line="360" w:lineRule="auto"/>
+              <w:jc w:val="both"/>
+              <w:rPr>
+                <w:rFonts w:ascii="Calibri" w:hAnsi="Calibri"/>
+                <w:b/>
+                <w:bCs w:val="0"/>
+                <w:i/>
+                <w:iCs/>
+                <w:color w:val="000000"/>
+                <w:sz w:val="18"/>
+                <w:szCs w:val="18"/>
+                <w:u w:val="none"/>
+              </w:rPr>
+            </w:pPr>
+            <w:r>
+              <w:rPr>
+                <w:rFonts w:ascii="Calibri" w:hAnsi="Calibri"/>
+                <w:b/>
+                <w:bCs w:val="0"/>
+                <w:i/>
+                <w:iCs/>
+                <w:color w:val="000000"/>
+                <w:sz w:val="18"/>
+                <w:szCs w:val="18"/>
+                <w:u w:val="none"/>
+              </w:rPr>
+              <w:t>{</w:t>
+            </w:r>
+            <w:r>
+              <w:rPr>
+                <w:rFonts w:ascii="Calibri" w:hAnsi="Calibri"/>
+                <w:b/>
+                <w:bCs w:val="0"/>
+                <w:i/>
+                <w:iCs/>
+                <w:sz w:val="18"/>
+                <w:szCs w:val="18"/>
+                <w:u w:val="none"/>
+              </w:rPr>
+              <w:t>AdjacentProjectManagerSignature</w:t>
+            </w:r>
+            <w:r>
+              <w:rPr>
+                <w:rFonts w:ascii="Calibri" w:hAnsi="Calibri"/>
+                <w:b/>
+                <w:bCs w:val="0"/>
+                <w:i/>
+                <w:iCs/>
+                <w:color w:val="000000"/>
+                <w:sz w:val="18"/>
+                <w:szCs w:val="18"/>
+                <w:u w:val="none"/>
+              </w:rPr>
+              <w:t>}</w:t>
+            </w:r>
+          </w:p>
+          <w:p>
+            <w:pPr>
+              <w:spacing w:line="360" w:lineRule="auto"/>
+              <w:jc w:val="both"/>
+              <w:rPr>
+                <w:rFonts w:ascii="Calibri" w:hAnsi="Calibri"/>
+                <w:b w:val="0"/>
+                <w:color w:val="000000"/>
+                <w:sz w:val="21"/>
+                <w:szCs w:val="21"/>
+                <w:u w:val="single"/>
+              </w:rPr>
+            </w:pPr>
+            <w:r>
+              <w:rPr>
+                <w:rFonts w:ascii="Calibri" w:hAnsi="Calibri"/>
+                <w:b w:val="0"/>
+                <w:color w:val="000000"/>
+                <w:sz w:val="21"/>
+                <w:szCs w:val="21"/>
+              </w:rPr>
+              <w:t>Colliery/Project Manager</w:t>
+            </w:r>
+          </w:p>
+        </w:tc>
+      </w:tr>
+      <w:tr>
+        <w:tblPrEx>
+          <w:tblBorders>
+            <w:top w:val="single" w:color="auto" w:sz="4" w:space="0"/>
+            <w:left w:val="single" w:color="auto" w:sz="4" w:space="0"/>
+            <w:bottom w:val="single" w:color="auto" w:sz="4" w:space="0"/>
+            <w:right w:val="single" w:color="auto" w:sz="4" w:space="0"/>
+            <w:insideH w:val="single" w:color="auto" w:sz="4" w:space="0"/>
+            <w:insideV w:val="single" w:color="auto" w:sz="4" w:space="0"/>
+          </w:tblBorders>
+          <w:tblCellMar>
+            <w:top w:w="0" w:type="dxa"/>
+            <w:left w:w="108" w:type="dxa"/>
+            <w:bottom w:w="0" w:type="dxa"/>
+            <w:right w:w="108" w:type="dxa"/>
+          </w:tblCellMar>
+        </w:tblPrEx>
+        <w:tc>
+          <w:tcPr>
+            <w:tcW w:w="3320" w:type="dxa"/>
+            <w:tcBorders>
+              <w:top w:val="nil"/>
+              <w:left w:val="nil"/>
+              <w:bottom w:val="nil"/>
+              <w:right w:val="nil"/>
+            </w:tcBorders>
+            <w:shd w:val="clear" w:color="auto" w:fill="FFFFFF"/>
+          </w:tcPr>
+          <w:p>
+            <w:pPr>
+              <w:spacing w:line="360" w:lineRule="auto"/>
+              <w:jc w:val="both"/>
+              <w:rPr>
+                <w:rFonts w:ascii="Calibri" w:hAnsi="Calibri"/>
+                <w:b/>
+                <w:bCs w:val="0"/>
+                <w:i/>
+                <w:iCs/>
+                <w:color w:val="000000"/>
+                <w:sz w:val="18"/>
+                <w:szCs w:val="18"/>
+                <w:u w:val="none"/>
+              </w:rPr>
+            </w:pPr>
+            <w:r>
+              <w:rPr>
+                <w:rFonts w:ascii="Calibri" w:hAnsi="Calibri"/>
+                <w:b/>
+                <w:bCs w:val="0"/>
+                <w:i/>
+                <w:iCs/>
+                <w:color w:val="000000"/>
+                <w:sz w:val="18"/>
+                <w:szCs w:val="18"/>
+                <w:u w:val="none"/>
+              </w:rPr>
+              <w:t>{</w:t>
+            </w:r>
+            <w:r>
+              <w:rPr>
+                <w:rFonts w:ascii="Calibri" w:hAnsi="Calibri"/>
+                <w:b/>
+                <w:bCs w:val="0"/>
+                <w:i/>
+                <w:iCs/>
+                <w:sz w:val="18"/>
+                <w:szCs w:val="18"/>
+                <w:u w:val="single"/>
+              </w:rPr>
+              <w:t>AdjacentProjectAgentSignature</w:t>
+            </w:r>
+            <w:r>
+              <w:rPr>
+                <w:rFonts w:ascii="Calibri" w:hAnsi="Calibri"/>
+                <w:b/>
+                <w:bCs w:val="0"/>
+                <w:i/>
+                <w:iCs/>
+                <w:color w:val="000000"/>
+                <w:sz w:val="18"/>
+                <w:szCs w:val="18"/>
+                <w:u w:val="none"/>
+              </w:rPr>
+              <w:t>}</w:t>
+            </w:r>
+          </w:p>
+          <w:p>
+            <w:pPr>
+              <w:spacing w:line="360" w:lineRule="auto"/>
+              <w:jc w:val="both"/>
+              <w:rPr>
+                <w:rFonts w:ascii="Calibri" w:hAnsi="Calibri"/>
+                <w:b w:val="0"/>
+                <w:color w:val="000000"/>
+                <w:sz w:val="21"/>
+                <w:szCs w:val="21"/>
+                <w:u w:val="none"/>
+              </w:rPr>
+            </w:pPr>
+            <w:r>
+              <w:rPr>
+                <w:rFonts w:ascii="Calibri" w:hAnsi="Calibri"/>
+                <w:b w:val="0"/>
+                <w:color w:val="000000"/>
+                <w:sz w:val="21"/>
+                <w:szCs w:val="21"/>
+              </w:rPr>
+              <w:t>Colliery/Project Agent</w:t>
+            </w:r>
+          </w:p>
+        </w:tc>
+        <w:tc>
+          <w:tcPr>
+            <w:tcW w:w="3321" w:type="dxa"/>
+            <w:tcBorders>
+              <w:top w:val="nil"/>
+              <w:left w:val="nil"/>
+              <w:bottom w:val="nil"/>
+              <w:right w:val="nil"/>
+            </w:tcBorders>
+            <w:shd w:val="clear" w:color="auto" w:fill="FFFFFF"/>
+          </w:tcPr>
+          <w:p>
+            <w:pPr>
+              <w:spacing w:line="360" w:lineRule="auto"/>
+              <w:jc w:val="both"/>
+              <w:rPr>
+                <w:rFonts w:hint="default" w:ascii="Calibri" w:hAnsi="Calibri"/>
+                <w:b/>
+                <w:bCs/>
+                <w:i/>
+                <w:iCs/>
+                <w:color w:val="000000"/>
+                <w:sz w:val="18"/>
+                <w:szCs w:val="18"/>
+                <w:u w:val="none"/>
+                <w:lang w:val="en-IN"/>
+              </w:rPr>
+            </w:pPr>
+            <w:r>
+              <w:rPr>
+                <w:rFonts w:hint="default" w:ascii="Calibri" w:hAnsi="Calibri"/>
+                <w:b/>
+                <w:bCs/>
+                <w:i/>
+                <w:iCs/>
+                <w:color w:val="000000"/>
+                <w:sz w:val="18"/>
+                <w:szCs w:val="18"/>
+                <w:u w:val="none"/>
+                <w:lang w:val="en-IN"/>
+              </w:rPr>
+              <w:t xml:space="preserve"> {</w:t>
+            </w:r>
+            <w:r>
+              <w:rPr>
+                <w:rFonts w:ascii="Calibri" w:hAnsi="Calibri"/>
+                <w:b/>
+                <w:bCs/>
+                <w:i/>
+                <w:iCs/>
+                <w:sz w:val="18"/>
+                <w:szCs w:val="18"/>
+                <w:u w:val="single"/>
+              </w:rPr>
+              <w:t>AdjacentAreaLandOfficerSignature</w:t>
+            </w:r>
+            <w:r>
+              <w:rPr>
+                <w:rFonts w:hint="default" w:ascii="Calibri" w:hAnsi="Calibri"/>
+                <w:b/>
+                <w:bCs/>
+                <w:i/>
+                <w:iCs/>
+                <w:color w:val="000000"/>
+                <w:sz w:val="18"/>
+                <w:szCs w:val="18"/>
+                <w:u w:val="none"/>
+                <w:lang w:val="en-IN"/>
+              </w:rPr>
+              <w:t>}</w:t>
+            </w:r>
+          </w:p>
+          <w:p>
+            <w:pPr>
+              <w:spacing w:line="360" w:lineRule="auto"/>
+              <w:jc w:val="both"/>
+              <w:rPr>
+                <w:rFonts w:ascii="Calibri" w:hAnsi="Calibri"/>
+                <w:b w:val="0"/>
+                <w:color w:val="000000"/>
+                <w:sz w:val="21"/>
+                <w:szCs w:val="21"/>
+                <w:vertAlign w:val="baseline"/>
+              </w:rPr>
+            </w:pPr>
+            <w:r>
+              <w:rPr>
+                <w:rFonts w:ascii="Calibri" w:hAnsi="Calibri"/>
+                <w:b w:val="0"/>
+                <w:color w:val="000000"/>
+                <w:sz w:val="21"/>
+                <w:szCs w:val="21"/>
+              </w:rPr>
+              <w:t xml:space="preserve">Area Land Dealing Officer </w:t>
+            </w:r>
+          </w:p>
+        </w:tc>
+        <w:tc>
+          <w:tcPr>
+            <w:tcW w:w="3321" w:type="dxa"/>
+            <w:tcBorders>
+              <w:top w:val="nil"/>
+              <w:left w:val="nil"/>
+              <w:bottom w:val="nil"/>
+              <w:right w:val="nil"/>
+            </w:tcBorders>
+            <w:shd w:val="clear" w:color="auto" w:fill="FFFFFF"/>
+          </w:tcPr>
+          <w:p>
+            <w:pPr>
+              <w:spacing w:line="360" w:lineRule="auto"/>
+              <w:jc w:val="both"/>
+              <w:rPr>
+                <w:rFonts w:hint="default" w:ascii="Calibri" w:hAnsi="Calibri"/>
+                <w:b/>
+                <w:bCs w:val="0"/>
+                <w:i/>
+                <w:iCs/>
+                <w:color w:val="000000"/>
+                <w:sz w:val="18"/>
+                <w:szCs w:val="18"/>
+                <w:u w:val="none"/>
+                <w:lang w:val="en-IN"/>
+              </w:rPr>
+            </w:pPr>
+            <w:r>
+              <w:rPr>
+                <w:rFonts w:hint="default" w:ascii="Calibri" w:hAnsi="Calibri"/>
+                <w:b/>
+                <w:bCs w:val="0"/>
+                <w:i/>
+                <w:iCs/>
+                <w:color w:val="000000"/>
+                <w:sz w:val="18"/>
+                <w:szCs w:val="18"/>
+                <w:u w:val="none"/>
+                <w:lang w:val="en-IN"/>
+              </w:rPr>
+              <w:t>{</w:t>
+            </w:r>
+            <w:r>
+              <w:rPr>
+                <w:rFonts w:ascii="Calibri" w:hAnsi="Calibri"/>
+                <w:b/>
+                <w:bCs w:val="0"/>
+                <w:i/>
+                <w:iCs/>
+                <w:sz w:val="18"/>
+                <w:szCs w:val="18"/>
+                <w:u w:val="none"/>
+              </w:rPr>
+              <w:t>AdjacentAreaGeneralManagerSignature</w:t>
+            </w:r>
+            <w:r>
+              <w:rPr>
+                <w:rFonts w:hint="default" w:ascii="Calibri" w:hAnsi="Calibri"/>
+                <w:b/>
+                <w:bCs w:val="0"/>
+                <w:i/>
+                <w:iCs/>
+                <w:color w:val="000000"/>
+                <w:sz w:val="18"/>
+                <w:szCs w:val="18"/>
+                <w:u w:val="none"/>
+                <w:lang w:val="en-IN"/>
+              </w:rPr>
+              <w:t>}</w:t>
+            </w:r>
+          </w:p>
+          <w:p>
+            <w:pPr>
+              <w:spacing w:line="360" w:lineRule="auto"/>
+              <w:jc w:val="both"/>
+              <w:rPr>
+                <w:rFonts w:hint="default" w:ascii="Calibri" w:hAnsi="Calibri"/>
+                <w:b w:val="0"/>
+                <w:color w:val="000000"/>
+                <w:sz w:val="21"/>
+                <w:szCs w:val="21"/>
+                <w:u w:val="none"/>
+                <w:lang w:val="en-IN"/>
+              </w:rPr>
+            </w:pPr>
+            <w:r>
+              <w:rPr>
+                <w:rFonts w:ascii="Calibri" w:hAnsi="Calibri"/>
+                <w:b w:val="0"/>
+                <w:color w:val="000000"/>
+                <w:sz w:val="21"/>
+                <w:szCs w:val="21"/>
+              </w:rPr>
+              <w:t>Area</w:t>
+            </w:r>
+            <w:r>
+              <w:rPr>
+                <w:rFonts w:ascii="Calibri" w:hAnsi="Calibri"/>
+                <w:b w:val="0"/>
+                <w:bCs/>
+                <w:color w:val="000000"/>
+                <w:sz w:val="21"/>
+                <w:szCs w:val="21"/>
+              </w:rPr>
+              <w:t xml:space="preserve"> </w:t>
+            </w:r>
+            <w:r>
+              <w:rPr>
+                <w:rFonts w:ascii="Calibri" w:hAnsi="Calibri"/>
+                <w:b w:val="0"/>
+                <w:color w:val="000000"/>
+                <w:sz w:val="21"/>
+                <w:szCs w:val="21"/>
+              </w:rPr>
+              <w:t xml:space="preserve">General Manager </w:t>
+            </w:r>
+          </w:p>
+        </w:tc>
+      </w:tr>
+    </w:tbl>
+    <w:p>
+      <w:pPr>
+        <w:rPr>
+          <w:rFonts w:ascii="Calibri" w:hAnsi="Calibri"/>
+        </w:rPr>
+      </w:pPr>
+      <w:r>
+        <w:rPr>
+          <w:rFonts w:ascii="Calibri" w:hAnsi="Calibri"/>
+        </w:rPr>
+        <w:t xml:space="preserve">                 </w:t>
+      </w:r>
     </w:p>
     <w:p>
       <w:pPr>
-        <w:spacing w:line="360" w:lineRule="auto"/>
-        <w:jc w:val="both"/>
+        <w:rPr>
+          <w:rFonts w:ascii="Calibri" w:hAnsi="Calibri"/>
+        </w:rPr>
+      </w:pPr>
+      <w:r>
         <w:rPr>
           <w:rFonts w:ascii="Calibri" w:hAnsi="Calibri"/>
           <w:b/>
           <w:bCs/>
-          <w:sz w:val="28"/>
-          <w:szCs w:val="28"/>
-          <w:u w:val="single"/>
-        </w:rPr>
-      </w:pPr>
-      <w:r>
-        <w:rPr>
-          <w:rFonts w:ascii="Calibri" w:hAnsi="Calibri"/>
-          <w:b/>
-          <w:bCs/>
-          <w:sz w:val="28"/>
-          <w:szCs w:val="28"/>
-          <w:u w:val="single"/>
-        </w:rPr>
-        <w:t>Signature of the adjacent colliery/ Area:</w:t>
-      </w:r>
-    </w:p>
-    <w:p>
-      <w:pPr>
-        <w:spacing w:line="360" w:lineRule="auto"/>
-        <w:jc w:val="both"/>
-        <w:rPr>
-          <w:rFonts w:ascii="Calibri" w:hAnsi="Calibri"/>
-          <w:sz w:val="20"/>
-          <w:szCs w:val="20"/>
-        </w:rPr>
-      </w:pPr>
-    </w:p>
-    <w:p>
-      <w:pPr>
-        <w:rPr>
-          <w:rFonts w:ascii="Calibri" w:hAnsi="Calibri"/>
-        </w:rPr>
-      </w:pPr>
-      <w:r>
-        <w:rPr>
-          <w:rFonts w:ascii="Calibri" w:hAnsi="Calibri"/>
-          <w:sz w:val="20"/>
-          <w:szCs w:val="20"/>
-          <w:u w:val="single"/>
-        </w:rPr>
-        <w:t>{AdjacentLandClerkSignature}</w:t>
-      </w:r>
-      <w:r>
-        <w:rPr>
-          <w:rFonts w:ascii="Calibri" w:hAnsi="Calibri"/>
-        </w:rPr>
-        <w:tab/>
-      </w:r>
-      <w:r>
-        <w:rPr>
-          <w:rFonts w:ascii="Calibri" w:hAnsi="Calibri"/>
-        </w:rPr>
-        <w:t xml:space="preserve">  </w:t>
-      </w:r>
-      <w:r>
-        <w:rPr>
-          <w:rFonts w:hint="default" w:ascii="Calibri" w:hAnsi="Calibri"/>
-          <w:lang w:val="en-IN"/>
-        </w:rPr>
-        <w:t xml:space="preserve">   </w:t>
-      </w:r>
-      <w:r>
-        <w:rPr>
-          <w:rFonts w:ascii="Calibri" w:hAnsi="Calibri"/>
-        </w:rPr>
-        <w:t xml:space="preserve">  </w:t>
-      </w:r>
-      <w:r>
-        <w:rPr>
-          <w:rFonts w:ascii="Calibri" w:hAnsi="Calibri"/>
-          <w:sz w:val="20"/>
-          <w:szCs w:val="20"/>
-          <w:u w:val="single"/>
-        </w:rPr>
-        <w:t>{AdjacentSurveyOfficerSignature}</w:t>
-      </w:r>
-      <w:r>
-        <w:rPr>
-          <w:rFonts w:ascii="Calibri" w:hAnsi="Calibri"/>
-        </w:rPr>
-        <w:t xml:space="preserve">    </w:t>
-      </w:r>
-      <w:r>
-        <w:rPr>
-          <w:rFonts w:hint="default" w:ascii="Calibri" w:hAnsi="Calibri"/>
-          <w:lang w:val="en-IN"/>
-        </w:rPr>
-        <w:t xml:space="preserve">          </w:t>
-      </w:r>
-      <w:r>
-        <w:rPr>
-          <w:rFonts w:ascii="Calibri" w:hAnsi="Calibri"/>
-        </w:rPr>
-        <w:t xml:space="preserve"> </w:t>
-      </w:r>
-      <w:r>
-        <w:rPr>
-          <w:rFonts w:ascii="Calibri" w:hAnsi="Calibri"/>
-          <w:sz w:val="20"/>
-          <w:szCs w:val="20"/>
-          <w:u w:val="single"/>
-        </w:rPr>
-        <w:t>{AdjacentProjectManagerSignature}</w:t>
-      </w:r>
-    </w:p>
-    <w:p>
-      <w:pPr>
-        <w:rPr>
-          <w:rFonts w:ascii="Calibri" w:hAnsi="Calibri"/>
-        </w:rPr>
-      </w:pPr>
-      <w:r>
-        <w:rPr>
-          <w:rFonts w:ascii="Calibri" w:hAnsi="Calibri"/>
-        </w:rPr>
-        <w:t>Land Clerk/Amin/Rev.Inspector           Surveyor/Survey Officer</w:t>
-      </w:r>
-      <w:r>
-        <w:rPr>
-          <w:rFonts w:ascii="Calibri" w:hAnsi="Calibri"/>
-        </w:rPr>
-        <w:tab/>
-      </w:r>
-      <w:r>
-        <w:rPr>
-          <w:rFonts w:ascii="Calibri" w:hAnsi="Calibri"/>
-        </w:rPr>
-        <w:t xml:space="preserve">          Colliery/Project Manager</w:t>
-      </w:r>
-    </w:p>
-    <w:p>
-      <w:pPr>
-        <w:rPr>
-          <w:rFonts w:ascii="Calibri" w:hAnsi="Calibri"/>
-        </w:rPr>
-      </w:pPr>
-    </w:p>
-    <w:p>
-      <w:pPr>
-        <w:rPr>
-          <w:rFonts w:ascii="Calibri" w:hAnsi="Calibri"/>
-          <w:sz w:val="18"/>
-          <w:szCs w:val="18"/>
-        </w:rPr>
-      </w:pPr>
-    </w:p>
-    <w:p>
-      <w:pPr>
-        <w:rPr>
-          <w:rFonts w:ascii="Calibri" w:hAnsi="Calibri"/>
-        </w:rPr>
-      </w:pPr>
-      <w:r>
-        <w:rPr>
-          <w:rFonts w:ascii="Calibri" w:hAnsi="Calibri"/>
-          <w:sz w:val="20"/>
-          <w:szCs w:val="20"/>
-          <w:u w:val="single"/>
-        </w:rPr>
-        <w:t>{AdjacentProjectAgentSignature}</w:t>
-      </w:r>
-      <w:r>
-        <w:rPr>
-          <w:rFonts w:ascii="Calibri" w:hAnsi="Calibri"/>
-          <w:sz w:val="20"/>
-          <w:szCs w:val="20"/>
-          <w:u w:val="none"/>
-        </w:rPr>
-        <w:t xml:space="preserve"> </w:t>
-      </w:r>
-      <w:r>
-        <w:rPr>
-          <w:rFonts w:ascii="Calibri" w:hAnsi="Calibri"/>
-          <w:sz w:val="20"/>
-          <w:szCs w:val="20"/>
-          <w:u w:val="none"/>
-        </w:rPr>
-        <w:tab/>
-      </w:r>
-      <w:r>
-        <w:rPr>
-          <w:rFonts w:hint="default" w:ascii="Calibri" w:hAnsi="Calibri"/>
-          <w:sz w:val="20"/>
-          <w:szCs w:val="20"/>
-          <w:u w:val="none"/>
-          <w:lang w:val="en-IN"/>
-        </w:rPr>
-        <w:t xml:space="preserve">    </w:t>
-      </w:r>
-      <w:r>
-        <w:rPr>
-          <w:rFonts w:ascii="Calibri" w:hAnsi="Calibri"/>
-          <w:sz w:val="20"/>
-          <w:szCs w:val="20"/>
-          <w:u w:val="single"/>
-        </w:rPr>
-        <w:t>{AdjacentAreaLandOfficerSignature}</w:t>
-      </w:r>
-      <w:r>
-        <w:rPr>
-          <w:rFonts w:ascii="Calibri" w:hAnsi="Calibri"/>
-          <w:sz w:val="20"/>
-          <w:szCs w:val="20"/>
-          <w:u w:val="none"/>
-        </w:rPr>
-        <w:t xml:space="preserve">     </w:t>
-      </w:r>
-      <w:r>
-        <w:rPr>
-          <w:rFonts w:hint="default" w:ascii="Calibri" w:hAnsi="Calibri"/>
-          <w:sz w:val="20"/>
-          <w:szCs w:val="20"/>
-          <w:u w:val="none"/>
-          <w:lang w:val="en-IN"/>
-        </w:rPr>
-        <w:t xml:space="preserve">    </w:t>
-      </w:r>
-      <w:r>
-        <w:rPr>
-          <w:rFonts w:ascii="Calibri" w:hAnsi="Calibri"/>
-          <w:sz w:val="20"/>
-          <w:szCs w:val="20"/>
-          <w:u w:val="single"/>
-        </w:rPr>
-        <w:t>{AdjacentAreaGeneralManagerSignature}</w:t>
-      </w:r>
-    </w:p>
-    <w:p>
-      <w:pPr>
-        <w:rPr>
-          <w:rFonts w:ascii="Calibri" w:hAnsi="Calibri"/>
-        </w:rPr>
-      </w:pPr>
-      <w:r>
-        <w:rPr>
-          <w:rFonts w:ascii="Calibri" w:hAnsi="Calibri"/>
-        </w:rPr>
-        <w:t>Colliery/Project Agent</w:t>
-      </w:r>
-      <w:r>
-        <w:rPr>
-          <w:rFonts w:ascii="Calibri" w:hAnsi="Calibri"/>
-        </w:rPr>
-        <w:tab/>
-      </w:r>
-      <w:r>
-        <w:rPr>
-          <w:rFonts w:ascii="Calibri" w:hAnsi="Calibri"/>
-        </w:rPr>
-        <w:t xml:space="preserve">   </w:t>
-      </w:r>
-      <w:r>
-        <w:rPr>
-          <w:rFonts w:hint="default" w:ascii="Calibri" w:hAnsi="Calibri"/>
-          <w:lang w:val="en-IN"/>
-        </w:rPr>
-        <w:t xml:space="preserve">                   </w:t>
-      </w:r>
-      <w:r>
-        <w:rPr>
-          <w:rFonts w:ascii="Calibri" w:hAnsi="Calibri"/>
-        </w:rPr>
-        <w:t>Area Land Dealing Officer                      Area</w:t>
-      </w:r>
-      <w:r>
-        <w:rPr>
-          <w:rFonts w:ascii="Calibri" w:hAnsi="Calibri"/>
-          <w:b/>
-          <w:bCs/>
-        </w:rPr>
-        <w:t xml:space="preserve"> </w:t>
-      </w:r>
-      <w:r>
-        <w:rPr>
-          <w:rFonts w:ascii="Calibri" w:hAnsi="Calibri"/>
-        </w:rPr>
-        <w:t xml:space="preserve">General Manager                     </w:t>
-      </w:r>
-    </w:p>
-    <w:p>
-      <w:pPr>
-        <w:rPr>
-          <w:rFonts w:ascii="Calibri" w:hAnsi="Calibri"/>
-        </w:rPr>
-      </w:pPr>
-    </w:p>
-    <w:p>
-      <w:pPr>
-        <w:rPr>
-          <w:rFonts w:ascii="Calibri" w:hAnsi="Calibri"/>
-        </w:rPr>
-      </w:pPr>
-    </w:p>
-    <w:p>
-      <w:pPr>
-        <w:rPr>
-          <w:rFonts w:ascii="Calibri" w:hAnsi="Calibri"/>
-        </w:rPr>
-      </w:pPr>
-      <w:r>
-        <w:rPr>
-          <w:rFonts w:ascii="Calibri" w:hAnsi="Calibri"/>
-          <w:b/>
-          <w:bCs/>
         </w:rPr>
         <w:t>Note:</w:t>
       </w:r>
@@ -986,7 +1619,16 @@
           <w:rFonts w:ascii="Cambria" w:hAnsi="Cambria"/>
           <w:b/>
         </w:rPr>
-        <w:t>Signatories are to mention his/ her full name, designation, date along with seal</w:t>
+        <w:t xml:space="preserve">Signatories are to mention his/ her full name, designation, date along with </w:t>
+      </w:r>
+      <w:bookmarkStart w:id="0" w:name="_GoBack"/>
+      <w:bookmarkEnd w:id="0"/>
+      <w:r>
+        <w:rPr>
+          <w:rFonts w:ascii="Cambria" w:hAnsi="Cambria"/>
+          <w:b/>
+        </w:rPr>
+        <w:t>seal</w:t>
       </w:r>
       <w:r>
         <w:rPr>
@@ -1298,6 +1940,28 @@
       </w:tblCellMar>
     </w:tblPr>
   </w:style>
+  <w:style w:type="table" w:styleId="4">
+    <w:name w:val="Table Grid"/>
+    <w:basedOn w:val="3"/>
+    <w:semiHidden/>
+    <w:unhideWhenUsed/>
+    <w:locked/>
+    <w:uiPriority w:val="0"/>
+    <w:pPr>
+      <w:widowControl w:val="0"/>
+      <w:jc w:val="both"/>
+    </w:pPr>
+    <w:tblPr>
+      <w:tblBorders>
+        <w:top w:val="single" w:color="auto" w:sz="4" w:space="0"/>
+        <w:left w:val="single" w:color="auto" w:sz="4" w:space="0"/>
+        <w:bottom w:val="single" w:color="auto" w:sz="4" w:space="0"/>
+        <w:right w:val="single" w:color="auto" w:sz="4" w:space="0"/>
+        <w:insideH w:val="single" w:color="auto" w:sz="4" w:space="0"/>
+        <w:insideV w:val="single" w:color="auto" w:sz="4" w:space="0"/>
+      </w:tblBorders>
+    </w:tblPr>
+  </w:style>
 </w:styles>
 </file>
 

</xml_diff>